<commit_message>
auto: XHS cards — 2026-08-30
</commit_message>
<xml_diff>
--- a/docs/xhs/2026-08-30/历史故事/发布文案.docx
+++ b/docs/xhs/2026-08-30/历史故事/发布文案.docx
@@ -11,7 +11,7 @@
         <w:rPr>
           <w:color w:val="CC3333"/>
         </w:rPr>
-        <w:t>所有历史迷！把这三个故事焊脑子里！</w:t>
+        <w:t>想懂历史？看这1首重阳诗就够了</w:t>
       </w:r>
     </w:p>
     <w:p>
@@ -40,25 +40,19 @@
         <w:spacing w:line="384" w:lineRule="auto"/>
       </w:pPr>
       <w:r>
-        <w:t>你敢信？李白第一次见贺知章，老贺直接拿金龟换酒请他喝！🔥</w:t>
+        <w:t>救命！王维17岁写的一首诗，居然把重阳节'焊死'在历史里了！🤯</w:t>
         <w:br/>
-        <w:t>那时候李白还没出名，贺知章读《蜀道难》读到“噫吁嚱”，当场拍桌：“此诗可以泣鬼神！”然后拉着李白就冲进酒馆。结果……身上没钱。你猜怎么着？解下腰间金龟就扔给店家！🤯</w:t>
+        <w:t>那年他一个人跑到长安当'北漂'，重阳节那天，街上所有人都在登高、插茱萸，他连个说话的人都没有。他想起小时候在蒲州老家，每年重阳都跟兄弟们爬山，哥哥会把茱萸分给他，他还会嫌苦不想戴。可这一刻，隔着华山，他突然想：兄弟们插茱萸时，会不会发现少了一个人，然后集体沉默几秒？</w:t>
         <w:br/>
-        <w:t>这就是大唐顶流之间的浪漫——真正的欣赏，根本不需要世俗身份加持。💡</w:t>
+        <w:t>于是他提笔写下了'独在异乡为异客，每逢佳节倍思亲'——这句话后来直接成了所有中国人在异乡的'嘴替'。最绝的是下一句'遍插茱萸少一人'，他不说自己多孤单，反而反过来问：家人会不会想我？这种'双向思念'，比单纯喊'我好想家'高级一万倍。💡</w:t>
         <w:br/>
-        <w:t>你以为这就完了？另一个故事更炸——</w:t>
+        <w:t>这首17岁的习作一火就是1300多年。直接把重阳节从'登高节'写成了'思念节'。后来的杜甫写'明年此会知谁健？醉把茱萸仔细看'，也是致敬王维。可以说，没王维这句诗，重阳节在传统文化里就少了一半的灵魂。</w:t>
         <w:br/>
-        <w:t>唐太宗李世民，明知魏征说话难听，却当众说：“以铜为镜，可以正衣冠；以古为镜，可以见兴替；以人为镜，可以知得失。”魏征死了，他哭到崩：“吾丧一镜矣！”🏯</w:t>
+        <w:t>🌟 金句：孤独不是没人陪伴，而是世界越热闹，你心里越空出了一个人的位置。</w:t>
         <w:br/>
-        <w:t>记住这句话：敢怼你的人，才是你人生最贵的镜子。</w:t>
+        <w:t>所以别再觉得古人不通人情。你想想，如果中秋你一个人在外地吃外卖，朋友圈全是团圆照，你就能瞬间懂王维了。</w:t>
         <w:br/>
-        <w:t>还有那个被全班笑“不务正业”的甘罗——12岁出使赵国，凭一张嘴让秦国白拿五座城。秦王当场封他上卿！别人问他凭什么？他说：“项橐七岁为孔子师，吾今十二，何负于秦？”📖</w:t>
-        <w:br/>
-        <w:t>年龄从来不是天花板，认知才是。</w:t>
-        <w:br/>
-        <w:t>这三个故事，一个拼眼光，一个拼胸襟，一个拼胆识。哪个不比你刷100条短视频带劲？🤯</w:t>
-        <w:br/>
-        <w:t>你最想穿越到哪个朝代？评论区蹲一个李白的酒友！👇</w:t>
+        <w:t>你最想对家人说的一句话是什么？评论区写下来，让TA看见👇</w:t>
       </w:r>
     </w:p>
     <w:p>
@@ -74,7 +68,7 @@
         <w:rPr>
           <w:color w:val="CC3333"/>
         </w:rPr>
-        <w:t>#历史故事  #国学智慧  #古人智慧  #每天学点历史  #传统文化  #冷知识  #自我提升  #格局打开</w:t>
+        <w:t>#历史故事  #国学智慧  #唐诗宋词  #传统文化  #每天学点历史  #冷知识  #自我提升  #认知升级</w:t>
       </w:r>
     </w:p>
     <w:p>
@@ -91,7 +85,7 @@
           <w:b/>
           <w:sz w:val="32"/>
         </w:rPr>
-        <w:t>古人卷疯了</w:t>
+        <w:t>一首诗封神</w:t>
       </w:r>
     </w:p>
     <w:p>
@@ -110,7 +104,7 @@
         <w:rPr>
           <w:sz w:val="24"/>
         </w:rPr>
-        <w:t>#1  唐 · 金龟换酒：贺知章识谪仙人  [唐诗背后的故事]</w:t>
+        <w:t>#1  唐 · 九月九日忆山东兄弟：一首诗留住重阳节  [唐诗宋词故事]</w:t>
       </w:r>
     </w:p>
     <w:p>
@@ -118,7 +112,7 @@
         <w:spacing w:line="336" w:lineRule="auto"/>
       </w:pPr>
       <w:r>
-        <w:t>💡 真正的欣赏不需要世俗身份加持，眼光与气度往往能成就他人，也成就一段千古佳话。</w:t>
+        <w:t>💡 真正的亲情不在朝夕相伴，而在天涯相隔时仍彼此惦念。孤独往往能催生最真挚的文学。</w:t>
       </w:r>
     </w:p>
     <w:p/>

</xml_diff>